<commit_message>
Release 1.1.5 with operator guide
</commit_message>
<xml_diff>
--- a/docs/Руководство оператора.docx
+++ b/docs/Руководство оператора.docx
@@ -140,7 +140,7 @@
           <w:szCs w:val="36"/>
           <w:lang w:val="ru-RU"/>
         </w:rPr>
-        <w:t>РУКОВОДСВО ОПЕРАТОРА</w:t>
+        <w:t>РУКОВОДСТВО ОПЕРАТОРА</w:t>
       </w:r>
     </w:p>
     <w:p>
@@ -197,39 +197,7 @@
           <w:rFonts w:hint="default"/>
           <w:lang w:val="ru-RU"/>
         </w:rPr>
-        <w:t>Содержание</w:t>
-      </w:r>
-    </w:p>
-    <w:p>
-      <w:pPr>
-        <w:rPr>
-          <w:rFonts w:hint="default"/>
-          <w:lang w:val="ru-RU"/>
-        </w:rPr>
-      </w:pPr>
-      <w:r>
-        <w:rPr>
-          <w:rFonts w:hint="default"/>
-          <w:lang w:val="ru-RU"/>
-        </w:rPr>
-        <w:br w:type="page"/>
-      </w:r>
-    </w:p>
-    <w:p>
-      <w:pPr>
-        <w:pStyle w:val="2"/>
-        <w:bidi w:val="0"/>
-        <w:rPr>
-          <w:rFonts w:hint="default"/>
-          <w:lang w:val="ru-RU"/>
-        </w:rPr>
-      </w:pPr>
-      <w:r>
-        <w:rPr>
-          <w:rFonts w:hint="default"/>
-          <w:lang w:val="ru-RU"/>
-        </w:rPr>
-        <w:t>Установка программного обеспечения (ПО)</w:t>
+        <w:t>Установка программного обеспечения</w:t>
       </w:r>
     </w:p>
     <w:p>
@@ -296,7 +264,30 @@
           <w:rFonts w:hint="default"/>
           <w:lang w:val="ru-RU"/>
         </w:rPr>
-        <w:t xml:space="preserve">Сначала необходимо установить приложение для технического контроля. Переходим по ссылке реопзитория </w:t>
+        <w:t>Сначала необходимо установи</w:t>
+      </w:r>
+      <w:bookmarkStart w:id="0" w:name="_GoBack"/>
+      <w:bookmarkEnd w:id="0"/>
+      <w:r>
+        <w:rPr>
+          <w:rFonts w:hint="default"/>
+          <w:lang w:val="ru-RU"/>
+        </w:rPr>
+        <w:t>ть приложение для технического контроля. Переходим по ссылке репозитория (</w:t>
+      </w:r>
+      <w:r>
+        <w:rPr>
+          <w:rFonts w:hint="default"/>
+          <w:lang w:val="en-US"/>
+        </w:rPr>
+        <w:t>QR</w:t>
+      </w:r>
+      <w:r>
+        <w:rPr>
+          <w:rFonts w:hint="default"/>
+          <w:lang w:val="ru-RU"/>
+        </w:rPr>
+        <w:t xml:space="preserve">-код справа) </w:t>
       </w:r>
       <w:r>
         <w:rPr>
@@ -307,12 +298,24 @@
         <w:fldChar w:fldCharType="begin"/>
       </w:r>
       <w:r>
+        <w:instrText xml:space="preserve"> HYPERLINK "https://github.com/sakurelle/CamCan" </w:instrText>
+      </w:r>
+      <w:r>
         <w:rPr>
           <w:rFonts w:hint="default"/>
           <w:u w:val="single"/>
           <w:lang w:val="ru-RU"/>
         </w:rPr>
-        <w:instrText xml:space="preserve"> HYPERLINK "https://github.com/sakurelle/CamCan:" </w:instrText>
+        <w:fldChar w:fldCharType="separate"/>
+      </w:r>
+      <w:r>
+        <w:rPr>
+          <w:rStyle w:val="5"/>
+          <w:rFonts w:hint="default"/>
+          <w:color w:val="auto"/>
+          <w:lang w:val="ru-RU"/>
+        </w:rPr>
+        <w:t>https://github.com/sakurelle/CamCan</w:t>
       </w:r>
       <w:r>
         <w:rPr>
@@ -320,25 +323,15 @@
           <w:u w:val="single"/>
           <w:lang w:val="ru-RU"/>
         </w:rPr>
-        <w:fldChar w:fldCharType="separate"/>
-      </w:r>
-      <w:r>
-        <w:rPr>
-          <w:rStyle w:val="5"/>
-          <w:rFonts w:hint="default"/>
-          <w:color w:val="auto"/>
-          <w:lang w:val="ru-RU"/>
-        </w:rPr>
-        <w:t>https://github.com/sakurelle/CamCan:</w:t>
-      </w:r>
-      <w:r>
-        <w:rPr>
-          <w:rFonts w:hint="default"/>
-          <w:u w:val="single"/>
-          <w:lang w:val="ru-RU"/>
-        </w:rPr>
         <w:fldChar w:fldCharType="end"/>
       </w:r>
+      <w:r>
+        <w:rPr>
+          <w:rFonts w:hint="default"/>
+          <w:lang w:val="ru-RU"/>
+        </w:rPr>
+        <w:t>:</w:t>
+      </w:r>
     </w:p>
     <w:p>
       <w:pPr>
@@ -353,109 +346,23 @@
           <w:rFonts w:hint="default"/>
           <w:lang w:val="ru-RU"/>
         </w:rPr>
-        <w:t>Находим последний релиз (</w:t>
-      </w:r>
-      <w:r>
-        <w:rPr>
-          <w:rFonts w:hint="default"/>
-          <w:lang w:val="en-US"/>
-        </w:rPr>
-        <w:t>Release</w:t>
-      </w:r>
-      <w:r>
-        <w:rPr>
-          <w:rFonts w:hint="default"/>
-          <w:lang w:val="ru-RU"/>
-        </w:rPr>
-        <w:t xml:space="preserve">) из репозитория </w:t>
-      </w:r>
-      <w:r>
-        <w:rPr>
-          <w:rFonts w:hint="default"/>
-          <w:lang w:val="en-US"/>
-        </w:rPr>
-        <w:t xml:space="preserve"> (</w:t>
-      </w:r>
-      <w:r>
-        <w:rPr>
-          <w:rFonts w:hint="default"/>
-          <w:lang w:val="ru-RU"/>
-        </w:rPr>
-        <w:t>рис. 1</w:t>
-      </w:r>
-      <w:r>
-        <w:rPr>
-          <w:rFonts w:hint="default"/>
-          <w:lang w:val="en-US"/>
-        </w:rPr>
-        <w:t>)</w:t>
-      </w:r>
-      <w:r>
-        <w:rPr>
-          <w:rFonts w:hint="default"/>
-          <w:lang w:val="ru-RU"/>
-        </w:rPr>
-        <w:t xml:space="preserve">. На 22.10.2026 это </w:t>
-      </w:r>
-      <w:r>
-        <w:rPr>
-          <w:rFonts w:hint="default" w:ascii="Times New Roman" w:hAnsi="Times New Roman" w:cs="Times New Roman"/>
-          <w:b w:val="0"/>
-          <w:bCs w:val="0"/>
-          <w:sz w:val="28"/>
-          <w:szCs w:val="28"/>
-          <w:highlight w:val="none"/>
-          <w:lang w:val="en-US"/>
-        </w:rPr>
-        <w:t>v1.1.4</w:t>
-      </w:r>
-      <w:r>
-        <w:rPr>
-          <w:rFonts w:hint="default" w:ascii="Times New Roman" w:hAnsi="Times New Roman" w:cs="Times New Roman"/>
-          <w:b w:val="0"/>
-          <w:bCs w:val="0"/>
-          <w:sz w:val="28"/>
-          <w:szCs w:val="28"/>
-          <w:lang w:val="en-US"/>
-        </w:rPr>
-        <w:t>.</w:t>
-      </w:r>
-    </w:p>
-    <w:p>
-      <w:pPr>
-        <w:bidi w:val="0"/>
-        <w:rPr>
-          <w:rFonts w:hint="default"/>
-          <w:lang w:val="ru-RU"/>
-        </w:rPr>
-      </w:pPr>
-      <w:r>
-        <w:rPr>
-          <w:rFonts w:hint="default"/>
-          <w:lang w:val="ru-RU"/>
-        </w:rPr>
-        <w:t xml:space="preserve">Далее скачиваем именно </w:t>
-      </w:r>
-      <w:r>
-        <w:rPr>
-          <w:rFonts w:hint="default"/>
-          <w:lang w:val="en-US"/>
-        </w:rPr>
-        <w:t>MarkerQC-Windowsx64.zip</w:t>
-      </w:r>
-      <w:r>
-        <w:rPr>
-          <w:rFonts w:hint="default"/>
-          <w:lang w:val="ru-RU"/>
-        </w:rPr>
-        <w:t>, как на рисунке 2</w:t>
-      </w:r>
-      <w:r>
-        <w:rPr>
-          <w:rFonts w:hint="default"/>
-          <w:lang w:val="en-US"/>
-        </w:rPr>
-        <w:t>.</w:t>
+        <w:t>На странице проекта откройте раздел «Releases» и выберите последнюю опубликованную версию (рис. 1). На момент подготовки руководства доступна версия v1.1.4. При появлении обновлений номер релиза может отличаться.</w:t>
+      </w:r>
+    </w:p>
+    <w:p>
+      <w:pPr>
+        <w:bidi w:val="0"/>
+        <w:rPr>
+          <w:rFonts w:hint="default"/>
+          <w:lang w:val="ru-RU"/>
+        </w:rPr>
+      </w:pPr>
+      <w:r>
+        <w:rPr>
+          <w:rFonts w:hint="default"/>
+          <w:lang w:val="ru-RU"/>
+        </w:rPr>
+        <w:t>В разделе «Assets» скачайте архив «MarkerQC-Windows-x64.zip» (рис. 2). Не путайте его с архивами исходного кода «Source code».</w:t>
       </w:r>
     </w:p>
     <w:p>
@@ -521,9 +428,10 @@
       <w:r>
         <w:rPr>
           <w:rFonts w:hint="default"/>
-          <w:lang w:val="ru-RU"/>
-        </w:rPr>
-        <w:t>Рисунок 1 - Главная страница репозитория.</w:t>
+          <w:i/>
+          <w:lang w:val="ru-RU"/>
+        </w:rPr>
+        <w:t>Рис. 1 — Главная страница репозитория.</w:t>
       </w:r>
     </w:p>
     <w:p>
@@ -589,60 +497,26 @@
       <w:r>
         <w:rPr>
           <w:rFonts w:hint="default"/>
-          <w:lang w:val="ru-RU"/>
-        </w:rPr>
-        <w:t xml:space="preserve">Рис. 2 - </w:t>
-      </w:r>
-      <w:r>
-        <w:rPr>
-          <w:rFonts w:hint="default"/>
-          <w:lang w:val="en-US"/>
-        </w:rPr>
-        <w:t>MarkerQC-Windowsx64</w:t>
-      </w:r>
-    </w:p>
-    <w:p>
-      <w:pPr>
-        <w:bidi w:val="0"/>
-        <w:rPr>
-          <w:rFonts w:hint="default"/>
-          <w:lang w:val="ru-RU"/>
-        </w:rPr>
-      </w:pPr>
-      <w:r>
-        <w:rPr>
-          <w:rFonts w:hint="default"/>
-          <w:lang w:val="ru-RU"/>
-        </w:rPr>
-        <w:t>Извлекаем полученный архив (</w:t>
-      </w:r>
-      <w:r>
-        <w:rPr>
-          <w:rFonts w:hint="default"/>
-          <w:lang w:val="en-US"/>
-        </w:rPr>
-        <w:t>.zip</w:t>
-      </w:r>
-      <w:r>
-        <w:rPr>
-          <w:rFonts w:hint="default"/>
-          <w:lang w:val="ru-RU"/>
-        </w:rPr>
-        <w:t xml:space="preserve">), опционально читаем содержимое </w:t>
-      </w:r>
-      <w:r>
-        <w:rPr>
-          <w:rFonts w:hint="default"/>
-          <w:lang w:val="en-US"/>
-        </w:rPr>
-        <w:t>README.md</w:t>
-      </w:r>
-      <w:r>
-        <w:rPr>
-          <w:rFonts w:hint="default"/>
-          <w:lang w:val="ru-RU"/>
-        </w:rPr>
-        <w:t>, и приложение готово к работе. На рисунке 3 представлен пример разархивированной папки.</w:t>
+          <w:i/>
+          <w:lang w:val="ru-RU"/>
+        </w:rPr>
+        <w:t>Рис. 2 — Архив Windows в разделе «Releases».</w:t>
+      </w:r>
+    </w:p>
+    <w:p>
+      <w:pPr>
+        <w:bidi w:val="0"/>
+        <w:rPr>
+          <w:rFonts w:hint="default"/>
+          <w:lang w:val="ru-RU"/>
+        </w:rPr>
+      </w:pPr>
+      <w:r>
+        <w:rPr>
+          <w:rFonts w:hint="default"/>
+          <w:lang w:val="ru-RU"/>
+        </w:rPr>
+        <w:t>Полностью распакуйте загруженный ZIP-архив в удобную папку. В ней должны находиться «MarkerQC.exe», каталог «_internal» и сопроводительные файлы (рис. 3). Запускайте программу из распакованной папки: переносить только EXE без «_internal» нельзя.</w:t>
       </w:r>
     </w:p>
     <w:p>
@@ -712,9 +586,22 @@
       <w:r>
         <w:rPr>
           <w:rFonts w:hint="default"/>
-          <w:lang w:val="ru-RU"/>
-        </w:rPr>
-        <w:t>Рис. 3 - Пример разархивированной папки.</w:t>
+          <w:i/>
+          <w:lang w:val="ru-RU"/>
+        </w:rPr>
+        <w:t>Рис. 3 — Содержимое распакованного архива.</w:t>
+      </w:r>
+    </w:p>
+    <w:p>
+      <w:pPr>
+        <w:bidi w:val="0"/>
+        <w:rPr>
+          <w:rFonts w:hint="default"/>
+          <w:lang w:val="ru-RU"/>
+        </w:rPr>
+      </w:pPr>
+      <w:r>
+        <w:t>При последующих обновлениях можно распаковать новую версию приложения в отдельную папку. Пользовательские измерения, настройки и калибровка хранятся вне папки с исполняемым файлом, поэтому удаление старой сборки само по себе не удаляет результаты.</w:t>
       </w:r>
     </w:p>
     <w:p>
@@ -763,21 +650,7 @@
           <w:rFonts w:hint="default"/>
           <w:lang w:val="ru-RU"/>
         </w:rPr>
-        <w:t xml:space="preserve">Запускаем </w:t>
-      </w:r>
-      <w:r>
-        <w:rPr>
-          <w:rFonts w:hint="default"/>
-          <w:lang w:val="en-US"/>
-        </w:rPr>
-        <w:t>MarkerQC.exe</w:t>
-      </w:r>
-      <w:r>
-        <w:rPr>
-          <w:rFonts w:hint="default"/>
-          <w:lang w:val="ru-RU"/>
-        </w:rPr>
-        <w:t>. Возможно уведомление об угрозе (рис. 4), игнорируем его и выполняем в любом случае (вы же доверяете мне?).</w:t>
+        <w:t>Запустите файл «MarkerQC.exe». Поскольку приложение может не иметь цифровой подписи (а оно не имеет), Windows SmartScreen иногда показывает предупреждение (рис. 4). Продолжайте запуск только после проверки, что архив скачан из официального репозитория CamCan и его источник вам известен. При необходимости откройте «Подробнее» и выберите «Выполнить в любом случае».</w:t>
       </w:r>
     </w:p>
     <w:p>
@@ -792,8 +665,8 @@
       <w:r>
         <w:drawing>
           <wp:inline distT="0" distB="0" distL="114300" distR="114300">
-            <wp:extent cx="3893185" cy="3674745"/>
-            <wp:effectExtent l="0" t="0" r="8255" b="13335"/>
+            <wp:extent cx="3576955" cy="3376295"/>
+            <wp:effectExtent l="0" t="0" r="4445" b="6985"/>
             <wp:docPr id="7" name="Изображение 4"/>
             <wp:cNvGraphicFramePr>
               <a:graphicFrameLocks xmlns:a="http://schemas.openxmlformats.org/drawingml/2006/main" noChangeAspect="1"/>
@@ -816,7 +689,7 @@
                   <pic:spPr>
                     <a:xfrm>
                       <a:off x="0" y="0"/>
-                      <a:ext cx="3893185" cy="3674745"/>
+                      <a:ext cx="3576955" cy="3376295"/>
                     </a:xfrm>
                     <a:prstGeom prst="rect">
                       <a:avLst/>
@@ -845,39 +718,26 @@
       <w:r>
         <w:rPr>
           <w:rFonts w:hint="default"/>
-          <w:lang w:val="ru-RU"/>
-        </w:rPr>
-        <w:t>Рис. 4 - Предупреждение угрозы.</w:t>
-      </w:r>
-    </w:p>
-    <w:p>
-      <w:pPr>
-        <w:bidi w:val="0"/>
-        <w:rPr>
-          <w:rFonts w:hint="default"/>
-          <w:lang w:val="ru-RU"/>
-        </w:rPr>
-      </w:pPr>
-      <w:r>
-        <w:rPr>
-          <w:rFonts w:hint="default"/>
-          <w:lang w:val="ru-RU"/>
-        </w:rPr>
-        <w:t>Знакомимся с интерфейсом и выполняем ряд настроек, в том числе ознакомительных. Сверху есть раскрывающийся список устройств, выбираем нашу камеру (чаще всего это камера 1). Справа оставляем разрешение 640</w:t>
-      </w:r>
-      <w:r>
-        <w:rPr>
-          <w:rFonts w:hint="default"/>
-          <w:lang w:val="en-US"/>
-        </w:rPr>
-        <w:t>x</w:t>
-      </w:r>
-      <w:r>
-        <w:rPr>
-          <w:rFonts w:hint="default"/>
-          <w:lang w:val="ru-RU"/>
-        </w:rPr>
-        <w:t>480 (если вы располагаете мощным компьютером, можно увеличивать разрешение) и нажимаем подключить - у вас появляется изображение с камеры.</w:t>
+          <w:i/>
+          <w:lang w:val="ru-RU"/>
+        </w:rPr>
+        <w:t>Рис. 4 — Предупреждение Windows SmartScreen.</w:t>
+      </w:r>
+    </w:p>
+    <w:p>
+      <w:pPr>
+        <w:bidi w:val="0"/>
+        <w:rPr>
+          <w:rFonts w:hint="default"/>
+          <w:lang w:val="ru-RU"/>
+        </w:rPr>
+      </w:pPr>
+      <w:r>
+        <w:rPr>
+          <w:rFonts w:hint="default"/>
+          <w:lang w:val="ru-RU"/>
+        </w:rPr>
+        <w:t>Подключите USB-микроскоп к компьютеру и откройте программу. В поле «Устройство» выберите нужную камеру (часто она отображается как «Камера 1»), затем выберите разрешение, например 640×480, и нажмите «Подключить» (рис. 5). Дождитесь появления изображения. Если нужной камеры в списке нет, воспользуйтесь кнопкой «Обновить камеры».</w:t>
       </w:r>
     </w:p>
     <w:p>
@@ -993,42 +853,27 @@
       </w:pPr>
       <w:r>
         <w:rPr>
-          <w:lang w:val="ru-RU"/>
-        </w:rPr>
-        <w:t>Рис</w:t>
-      </w:r>
-      <w:r>
-        <w:rPr>
-          <w:rFonts w:hint="default"/>
-          <w:lang w:val="ru-RU"/>
-        </w:rPr>
-        <w:t>. 5 - Настройка камеры.</w:t>
-      </w:r>
-    </w:p>
-    <w:p>
-      <w:pPr>
-        <w:bidi w:val="0"/>
-        <w:rPr>
-          <w:rFonts w:hint="default"/>
-          <w:lang w:val="ru-RU"/>
-        </w:rPr>
-      </w:pPr>
-      <w:r>
-        <w:rPr>
-          <w:rFonts w:hint="default"/>
-          <w:lang w:val="ru-RU"/>
-        </w:rPr>
-        <w:t xml:space="preserve">Снизу, в панели инструментов есть три настройки (рис. 6). </w:t>
-      </w:r>
-    </w:p>
-    <w:p>
-      <w:pPr>
-        <w:bidi w:val="0"/>
-        <w:rPr>
-          <w:rFonts w:hint="default"/>
-          <w:lang w:val="ru-RU"/>
-        </w:rPr>
-      </w:pPr>
+          <w:i/>
+          <w:lang w:val="ru-RU"/>
+        </w:rPr>
+        <w:t>Рис. 5 — Выбор камеры и разрешения.</w:t>
+      </w:r>
+    </w:p>
+    <w:p>
+      <w:pPr>
+        <w:bidi w:val="0"/>
+        <w:rPr>
+          <w:rFonts w:hint="default"/>
+          <w:lang w:val="ru-RU"/>
+        </w:rPr>
+      </w:pPr>
+      <w:r>
+        <w:rPr>
+          <w:rFonts w:hint="default"/>
+          <w:lang w:val="ru-RU"/>
+        </w:rPr>
+        <w:t>В нижней панели находятся основные инструменты: «Область поиска», «Калибровка» и «Коррекция точек» (рис. 6). Перед серийным контролем необходимо выбрать область поиска и убедиться, что масштаб изображения откалиброван.</w:t>
+      </w:r>
     </w:p>
     <w:p>
       <w:pPr>
@@ -1095,39 +940,26 @@
       <w:r>
         <w:rPr>
           <w:rFonts w:hint="default"/>
-          <w:lang w:val="ru-RU"/>
-        </w:rPr>
-        <w:t>Рис. 6 - Инструменты.</w:t>
-      </w:r>
-    </w:p>
-    <w:p>
-      <w:pPr>
-        <w:bidi w:val="0"/>
-        <w:rPr>
-          <w:rFonts w:hint="default"/>
-          <w:lang w:val="ru-RU"/>
-        </w:rPr>
-      </w:pPr>
-      <w:r>
-        <w:rPr>
-          <w:rFonts w:hint="default"/>
-          <w:lang w:val="ru-RU"/>
-        </w:rPr>
-        <w:t xml:space="preserve">Сначала настраиваем область поиска. Аналогично выделению на рабочем столе </w:t>
-      </w:r>
-      <w:r>
-        <w:rPr>
-          <w:rFonts w:hint="default"/>
-          <w:lang w:val="en-US"/>
-        </w:rPr>
-        <w:t xml:space="preserve">Windows </w:t>
-      </w:r>
-      <w:r>
-        <w:rPr>
-          <w:rFonts w:hint="default"/>
-          <w:lang w:val="ru-RU"/>
-        </w:rPr>
-        <w:t>просто выделяем область, где допускается положение маркера (программа будет искать маркер только в выделенной области). Соответственно, на рисунке 7, указаны неудачный и удачный выбор области. Удачный выбор также обусловлен тем, что в верхней части подложки имеется цветовая неоднородность и это может сбить алгоритм. В идеале, разумеется, чтобы была выделена вся область.</w:t>
+          <w:i/>
+          <w:lang w:val="ru-RU"/>
+        </w:rPr>
+        <w:t>Рис. 6 — Инструменты программы.</w:t>
+      </w:r>
+    </w:p>
+    <w:p>
+      <w:pPr>
+        <w:bidi w:val="0"/>
+        <w:rPr>
+          <w:rFonts w:hint="default"/>
+          <w:lang w:val="ru-RU"/>
+        </w:rPr>
+      </w:pPr>
+      <w:r>
+        <w:rPr>
+          <w:rFonts w:hint="default"/>
+          <w:lang w:val="ru-RU"/>
+        </w:rPr>
+        <w:t>Сначала нажмите «Область поиска» и выделите мышью участок кадра, в пределах которого может находиться маркер (рис. 7). Лучше использовать ровную светлую часть подложки, исключив тёмную кромку, калибровочную полоску и посторонние предметы. При этом область должна быть достаточно большой, чтобы маркер целиком помещался в ней при каждом измерении. Слишком узкая область может приводить к потере распознавания.</w:t>
       </w:r>
     </w:p>
     <w:p>
@@ -1247,41 +1079,42 @@
       <w:r>
         <w:rPr>
           <w:rFonts w:hint="default"/>
-          <w:lang w:val="ru-RU"/>
-        </w:rPr>
-        <w:t>Рис. 7 - Выделение области</w:t>
-      </w:r>
-    </w:p>
-    <w:p>
-      <w:pPr>
-        <w:bidi w:val="0"/>
-        <w:rPr>
-          <w:rFonts w:hint="default"/>
-          <w:lang w:val="ru-RU"/>
-        </w:rPr>
-      </w:pPr>
-      <w:r>
-        <w:rPr>
-          <w:rFonts w:hint="default"/>
-          <w:lang w:val="ru-RU"/>
-        </w:rPr>
-        <w:t>В случае необходимости оставляем или убираем галочку напротив пункта показывать рамку области поиска, она влияет только на изображение с камеры, алгоритм она не затрагивает.</w:t>
-      </w:r>
-    </w:p>
-    <w:p>
-      <w:pPr>
-        <w:bidi w:val="0"/>
-        <w:rPr>
-          <w:rFonts w:hint="default"/>
-          <w:lang w:val="ru-RU"/>
-        </w:rPr>
-      </w:pPr>
-      <w:r>
-        <w:rPr>
-          <w:rFonts w:hint="default"/>
-          <w:lang w:val="ru-RU"/>
-        </w:rPr>
-        <w:t>Далее производим калибровку датчика. Используя специальный калибр, соединяем две точки, которые гарантированно дают 10мм (рис. 8) и нажимаем Ок. Также можно использовать калибр другой длины, изменив соответствующий параметр вверху окна. В случае чего, также можно изменить масштаб изображения в окне калибровки, с помощью интерфейса в правом верхнем углу.</w:t>
+          <w:i/>
+          <w:lang w:val="ru-RU"/>
+        </w:rPr>
+        <w:t>Рис. 7 — Примеры выбора области поиска.</w:t>
+      </w:r>
+    </w:p>
+    <w:p>
+      <w:pPr>
+        <w:bidi w:val="0"/>
+        <w:rPr>
+          <w:rFonts w:hint="default"/>
+          <w:lang w:val="ru-RU"/>
+        </w:rPr>
+      </w:pPr>
+      <w:r>
+        <w:rPr>
+          <w:rFonts w:hint="default"/>
+          <w:lang w:val="ru-RU"/>
+        </w:rPr>
+        <w:t>Флажок «Показывать рамку области поиска» управляет только отображением её границы: само ограничение распознавания продолжает действовать. Кнопка «Весь кадр» в окне выбора области позволяет сбросить это ограничение. Область поиска влияет на обнаружение маркера, но не на масштаб калибровки.</w:t>
+      </w:r>
+    </w:p>
+    <w:p>
+      <w:pPr>
+        <w:bidi w:val="0"/>
+        <w:rPr>
+          <w:rFonts w:hint="default"/>
+          <w:lang w:val="ru-RU"/>
+        </w:rPr>
+      </w:pPr>
+      <w:r>
+        <w:rPr>
+          <w:rFonts w:hint="default"/>
+          <w:lang w:val="ru-RU"/>
+        </w:rPr>
+        <w:t>Затем нажмите «Калибровка». Установите специальную шкалу и последовательно укажите две хорошо различимые точки с известным расстоянием между ними (рис. 8). По умолчанию используется отрезок 10,00 мм; при другом эталоне сначала измените значение в поле «Реальное расстояние, мм». Для более точного выбора точек используйте кнопки увеличения изображения в правом верхнем углу окна. После проверки выбранных точек нажмите «ОК».</w:t>
       </w:r>
     </w:p>
     <w:p>
@@ -1351,9 +1184,34 @@
       <w:r>
         <w:rPr>
           <w:rFonts w:hint="default"/>
-          <w:lang w:val="ru-RU"/>
-        </w:rPr>
-        <w:t>Рис. 8 - Калибровка устройства.</w:t>
+          <w:i/>
+          <w:lang w:val="ru-RU"/>
+        </w:rPr>
+        <w:t>Рис. 8 — Калибровка масштаба изображения.</w:t>
+      </w:r>
+    </w:p>
+    <w:p>
+      <w:pPr>
+        <w:bidi w:val="0"/>
+        <w:rPr>
+          <w:rFonts w:hint="default"/>
+          <w:lang w:val="ru-RU"/>
+        </w:rPr>
+      </w:pPr>
+      <w:r>
+        <w:t>После калибровки проверьте, что программа показывает активный масштаб, а выбранная камера и разрешение соответствуют текущей установке. Для контроля полезно повторно измерить известный эталон: это позволит обнаружить ошибку выбора точек до начала работы с партией.</w:t>
+      </w:r>
+    </w:p>
+    <w:p>
+      <w:pPr>
+        <w:bidi w:val="0"/>
+        <w:rPr>
+          <w:rFonts w:hint="default"/>
+          <w:lang w:val="ru-RU"/>
+        </w:rPr>
+      </w:pPr>
+      <w:r>
+        <w:t>Если изменились положение камеры, рабочая высота, оптика, масштаб или разрешение, проверьте калибровку повторно. Камера и измеряемый маркер должны сохранять постоянное положение относительно рабочей поверхности; смещение или наклон микроскопа может изменить результаты.</w:t>
       </w:r>
     </w:p>
     <w:p>
@@ -1400,22 +1258,22 @@
           <w:rFonts w:hint="default"/>
           <w:lang w:val="ru-RU"/>
         </w:rPr>
-        <w:t>Первый делом включаем подсветку устройства и диммером выставляем такую яркость, чтобы изображение было примерно таким, как на фото ниже.</w:t>
-      </w:r>
-    </w:p>
-    <w:p>
-      <w:pPr>
-        <w:rPr>
-          <w:rFonts w:hint="default"/>
-          <w:lang w:val="ru-RU"/>
-        </w:rPr>
-      </w:pPr>
-      <w:r>
-        <w:rPr>
-          <w:rFonts w:hint="default"/>
-          <w:lang w:val="ru-RU"/>
-        </w:rPr>
-        <w:t>При попадании маркера в выделенную область, программа автоматически его находит и определяет его размеры. Пример изображен на рисунке 9.</w:t>
+        <w:t>Перед началом работы включите подсветку установки и отрегулируйте её диммером. Изображение должно быть достаточно светлым, с чётким контуром маркера, но без пересвеченных участков и сильных бликов. Убедитесь, что микроскоп неподвижен, а фокус настроен. Эти условия особенно важны для точного определения ширины и положения перегиба.</w:t>
+      </w:r>
+    </w:p>
+    <w:p>
+      <w:pPr>
+        <w:rPr>
+          <w:rFonts w:hint="default"/>
+          <w:lang w:val="ru-RU"/>
+        </w:rPr>
+      </w:pPr>
+      <w:r>
+        <w:rPr>
+          <w:rFonts w:hint="default"/>
+          <w:lang w:val="ru-RU"/>
+        </w:rPr>
+        <w:t>Разместите маркер на подложке внутри выбранной области поиска. Программа автоматически определяет его контур и непрерывно показывает текущие измерения (рис. 9). На изображении появляются измерительные точки: красные L1/L2 задают длину, синие W1/W2/WC — ширину. Перед сохранением результата (а сохранять его не обязательно) проверьте, что точки действительно расположены на нужных участках маркера.</w:t>
       </w:r>
     </w:p>
     <w:p>
@@ -1480,24 +1338,25 @@
       <w:r>
         <w:rPr>
           <w:rFonts w:hint="default"/>
-          <w:lang w:val="ru-RU"/>
-        </w:rPr>
-        <w:t>Рис. 9 - Пример рабочего интерфейса.</w:t>
-      </w:r>
-    </w:p>
-    <w:p>
-      <w:pPr>
-        <w:rPr>
-          <w:rFonts w:hint="default"/>
-          <w:lang w:val="ru-RU"/>
-        </w:rPr>
-      </w:pPr>
-      <w:r>
-        <w:rPr>
-          <w:rFonts w:hint="default"/>
-          <w:lang w:val="ru-RU"/>
-        </w:rPr>
-        <w:t>Справа указываются актуальные параметры данного маркера, они будут красными, если несоответствуют допуску и зелеными, если соответствуют. При необходимости, сверху имеются настройки, а именно допуски, где можно указать необходимые допуски для определенной партии маркеров (рис. 10).</w:t>
+          <w:i/>
+          <w:lang w:val="ru-RU"/>
+        </w:rPr>
+        <w:t>Рис. 9 — Основное окно измерения.</w:t>
+      </w:r>
+    </w:p>
+    <w:p>
+      <w:pPr>
+        <w:rPr>
+          <w:rFonts w:hint="default"/>
+          <w:lang w:val="ru-RU"/>
+        </w:rPr>
+      </w:pPr>
+      <w:r>
+        <w:rPr>
+          <w:rFonts w:hint="default"/>
+          <w:lang w:val="ru-RU"/>
+        </w:rPr>
+        <w:t>В правой панели отображаются длина, ширина, положение перегиба и итоговая оценка. Соответствующие допуску значения выделяются зелёным, выходящие за пределы — красным. Допуски и нормативные размеры задаются в окне «Нормативные размеры» (рис. 10). Для стандартных маркеров в проекте предусмотрены ориентиры: длина 7,00 ± 0,10 мм и ширина 1,15 ± 0,05 мм, но перед контролем партии необходимо проверить применяемые нормы и при необходимости изменить их. Решение о годности принимается по неокруглённым значениям.</w:t>
       </w:r>
     </w:p>
     <w:p>
@@ -1552,8 +1411,6 @@
           </wp:inline>
         </w:drawing>
       </w:r>
-      <w:bookmarkStart w:id="0" w:name="_GoBack"/>
-      <w:bookmarkEnd w:id="0"/>
     </w:p>
     <w:p>
       <w:pPr>
@@ -1567,24 +1424,25 @@
       <w:r>
         <w:rPr>
           <w:rFonts w:hint="default"/>
-          <w:lang w:val="ru-RU"/>
-        </w:rPr>
-        <w:t>Рис. 10 - Допуски маркеров.</w:t>
-      </w:r>
-    </w:p>
-    <w:p>
-      <w:pPr>
-        <w:rPr>
-          <w:rFonts w:hint="default"/>
-          <w:lang w:val="ru-RU"/>
-        </w:rPr>
-      </w:pPr>
-      <w:r>
-        <w:rPr>
-          <w:rFonts w:hint="default"/>
-          <w:lang w:val="ru-RU"/>
-        </w:rPr>
-        <w:t>В случае, если границы маркера определились неверно, можно воспользоваться функцией коррекции точек из панели инструментов снизу. Ее пример показан на рисунке 11. В таком случае, после корректировки, необходимо нажать кнопку Измерить, находящуюся справа, чтобы алгоритм продолжил работу в автоматическом режиме.</w:t>
+          <w:i/>
+          <w:lang w:val="ru-RU"/>
+        </w:rPr>
+        <w:t>Рис. 10 — Настройка нормативных размеров и допусков.</w:t>
+      </w:r>
+    </w:p>
+    <w:p>
+      <w:pPr>
+        <w:rPr>
+          <w:rFonts w:hint="default"/>
+          <w:lang w:val="ru-RU"/>
+        </w:rPr>
+      </w:pPr>
+      <w:r>
+        <w:rPr>
+          <w:rFonts w:hint="default"/>
+          <w:lang w:val="ru-RU"/>
+        </w:rPr>
+        <w:t>Если программа неверно определила характерные точки, нажмите «Коррекция точек» на нижней панели (рис. 11). В отдельном окне отображается зафиксированный кадр: переместите неправильно установленные точки на соответствующие участки контура. При необходимости увеличьте изображение для точной корректировки. Проверьте результат и подтвердите изменения. Затем нажмите «Измерить», чтобы зафиксировать проверенный результат в истории.</w:t>
       </w:r>
     </w:p>
     <w:p>
@@ -1652,52 +1510,25 @@
       <w:r>
         <w:rPr>
           <w:rFonts w:hint="default"/>
-          <w:lang w:val="ru-RU"/>
-        </w:rPr>
-        <w:t>Рис. 11 - Корректировка маркера.</w:t>
-      </w:r>
-    </w:p>
-    <w:p>
-      <w:pPr>
-        <w:rPr>
-          <w:rFonts w:hint="default"/>
-          <w:lang w:val="ru-RU"/>
-        </w:rPr>
-      </w:pPr>
-      <w:r>
-        <w:rPr>
-          <w:rFonts w:hint="default"/>
-          <w:lang w:val="ru-RU"/>
-        </w:rPr>
-        <w:t xml:space="preserve">Также имеется вкладка История (рис. 12). При нажатии Измерить, локально сохраняться данные о текущем измерении маркера, это необходимо для отчетности и калибровки производственного процесса. При отсутствии необходимости, сохранять данные не нужно. Эти данные можно удалить или экспортировать в </w:t>
-      </w:r>
-      <w:r>
-        <w:rPr>
-          <w:rFonts w:hint="default"/>
-          <w:lang w:val="en-US"/>
-        </w:rPr>
-        <w:t xml:space="preserve">CSV </w:t>
-      </w:r>
-      <w:r>
-        <w:rPr>
-          <w:rFonts w:hint="default"/>
-          <w:lang w:val="ru-RU"/>
-        </w:rPr>
-        <w:t xml:space="preserve">или </w:t>
-      </w:r>
-      <w:r>
-        <w:rPr>
-          <w:rFonts w:hint="default"/>
-          <w:lang w:val="en-US"/>
-        </w:rPr>
-        <w:t>Excel</w:t>
-      </w:r>
-      <w:r>
-        <w:rPr>
-          <w:rFonts w:hint="default"/>
-          <w:lang w:val="ru-RU"/>
-        </w:rPr>
-        <w:t>, соответствующими кнопка снизу данной вкладки.</w:t>
+          <w:i/>
+          <w:lang w:val="ru-RU"/>
+        </w:rPr>
+        <w:t>Рис. 11 — Ручная коррекция измерительных точек.</w:t>
+      </w:r>
+    </w:p>
+    <w:p>
+      <w:pPr>
+        <w:rPr>
+          <w:rFonts w:hint="default"/>
+          <w:lang w:val="ru-RU"/>
+        </w:rPr>
+      </w:pPr>
+      <w:r>
+        <w:rPr>
+          <w:rFonts w:hint="default"/>
+          <w:lang w:val="ru-RU"/>
+        </w:rPr>
+        <w:t>Во вкладке «История» (рис. 12) хранятся только зафиксированные результаты. Непрерывное отображение размеров на экране само по себе не создаёт новую запись: для сохранения текущего согласованного кадра и измерений нажмите «Измерить». В истории можно просматривать записи, экспортировать данные в CSV или Excel, а также полностью очищать журнал с подтверждением. Очистка удаляет сохранённые измерения и связанные снимки, но не должна сбрасывать калибровку и настройки камеры.</w:t>
       </w:r>
     </w:p>
     <w:p>
@@ -1765,25 +1596,26 @@
       <w:r>
         <w:rPr>
           <w:rFonts w:hint="default"/>
-          <w:lang w:val="ru-RU"/>
-        </w:rPr>
-        <w:t>Рис. 12 - Вкладка Истории.</w:t>
-      </w:r>
-    </w:p>
-    <w:p>
-      <w:pPr>
-        <w:bidi w:val="0"/>
-        <w:rPr>
-          <w:rFonts w:hint="default"/>
-          <w:lang w:val="ru-RU"/>
-        </w:rPr>
-      </w:pPr>
-      <w:r>
-        <w:rPr>
-          <w:rFonts w:hint="default"/>
-          <w:lang w:val="ru-RU"/>
-        </w:rPr>
-        <w:t>По итогу, валидными являются только те маркеры, все данные на которых являются зелеными (то есть входят в допуск) в правой панели (рис. 13).</w:t>
+          <w:i/>
+          <w:lang w:val="ru-RU"/>
+        </w:rPr>
+        <w:t>Рис. 12 — Вкладка «История».</w:t>
+      </w:r>
+    </w:p>
+    <w:p>
+      <w:pPr>
+        <w:bidi w:val="0"/>
+        <w:rPr>
+          <w:rFonts w:hint="default"/>
+          <w:lang w:val="ru-RU"/>
+        </w:rPr>
+      </w:pPr>
+      <w:r>
+        <w:rPr>
+          <w:rFonts w:hint="default"/>
+          <w:lang w:val="ru-RU"/>
+        </w:rPr>
+        <w:t>Итоговый результат следует принимать только при корректном распознавании маркера и соблюдении всех настроенных допусков: длины, ширины и положения перегиба. В этом случае программа показывает положительный статус, а соответствующие значения — зелёным (рис. 13). Если маркер не найден, касается границы области поиска или обнаружено несколько кандидатов, корректного измерения может не быть; отсутствие результата не следует считать подтверждённым браком.</w:t>
       </w:r>
     </w:p>
     <w:p>
@@ -1853,9 +1685,46 @@
       <w:r>
         <w:rPr>
           <w:rFonts w:hint="default"/>
-          <w:lang w:val="ru-RU"/>
-        </w:rPr>
-        <w:t>Рис. 13 - Валидный результат.</w:t>
+          <w:i/>
+          <w:lang w:val="ru-RU"/>
+        </w:rPr>
+        <w:t>Рис. 13 — Пример соответствующего требованиям маркера.</w:t>
+      </w:r>
+    </w:p>
+    <w:p>
+      <w:pPr>
+        <w:bidi w:val="0"/>
+        <w:rPr>
+          <w:rFonts w:hint="default"/>
+          <w:lang w:val="ru-RU"/>
+        </w:rPr>
+      </w:pPr>
+      <w:r>
+        <w:t>При работе с партией проверяйте настройку освещения, фокус, актуальные допуски и калибровку перед началом серии. Если размеры резко изменились без видимой причины, сначала проверьте расположение маркера и правильность определения точек, затем повторите измерение.</w:t>
+      </w:r>
+    </w:p>
+    <w:p>
+      <w:pPr>
+        <w:bidi w:val="0"/>
+        <w:rPr>
+          <w:rFonts w:hint="default"/>
+          <w:lang w:val="ru-RU"/>
+        </w:rPr>
+      </w:pPr>
+      <w:r>
+        <w:t>Если камера не подключается, проверьте USB-кабель и подключение микроскопа, закройте другие программы, использующие камеру, и нажмите «Обновить камеры». При нестабильном распознавании уменьшите блики, уточните область поиска и убедитесь, что маркер целиком находится в кадре.</w:t>
+      </w:r>
+    </w:p>
+    <w:p>
+      <w:pPr>
+        <w:bidi w:val="0"/>
+        <w:rPr>
+          <w:rFonts w:hint="default"/>
+          <w:lang w:val="ru-RU"/>
+        </w:rPr>
+      </w:pPr>
+      <w:r>
+        <w:t>История, настройки и калибровочные данные приложения сохраняются в пользовательском каталоге Windows «%LOCALAPPDATA%\MarkerQC». Для архивирования результатов используйте экспорт во вкладке «История»; не удаляйте пользовательскую папку, если требуется сохранить накопленные данные.</w:t>
       </w:r>
     </w:p>
     <w:p>
@@ -1946,7 +1815,7 @@
 <w:ftr xmlns:wpc="http://schemas.microsoft.com/office/word/2010/wordprocessingCanvas" xmlns:mc="http://schemas.openxmlformats.org/markup-compatibility/2006" xmlns:o="urn:schemas-microsoft-com:office:office" xmlns:r="http://schemas.openxmlformats.org/officeDocument/2006/relationships" xmlns:m="http://schemas.openxmlformats.org/officeDocument/2006/math" xmlns:v="urn:schemas-microsoft-com:vml" xmlns:wp14="http://schemas.microsoft.com/office/word/2010/wordprocessingDrawing" xmlns:wp="http://schemas.openxmlformats.org/drawingml/2006/wordprocessingDrawing" xmlns:w10="urn:schemas-microsoft-com:office:word" xmlns:w="http://schemas.openxmlformats.org/wordprocessingml/2006/main" xmlns:w14="http://schemas.microsoft.com/office/word/2010/wordml" xmlns:w15="http://schemas.microsoft.com/office/word/2012/wordml" xmlns:wpg="http://schemas.microsoft.com/office/word/2010/wordprocessingGroup" xmlns:wpi="http://schemas.microsoft.com/office/word/2010/wordprocessingInk" xmlns:wne="http://schemas.microsoft.com/office/word/2006/wordml" xmlns:wps="http://schemas.microsoft.com/office/word/2010/wordprocessingShape" xmlns:wpsCustomData="http://www.wps.cn/officeDocument/2013/wpsCustomData" mc:Ignorable="w14 w15 wp14">
   <w:p>
     <w:pPr>
-      <w:pStyle w:val="7"/>
+      <w:pStyle w:val="8"/>
       <w:jc w:val="center"/>
       <w:rPr>
         <w:rFonts w:hint="default" w:ascii="Times New Roman" w:hAnsi="Times New Roman" w:cs="Times New Roman"/>
@@ -1963,7 +1832,7 @@
 <w:ftr xmlns:wpc="http://schemas.microsoft.com/office/word/2010/wordprocessingCanvas" xmlns:mc="http://schemas.openxmlformats.org/markup-compatibility/2006" xmlns:o="urn:schemas-microsoft-com:office:office" xmlns:r="http://schemas.openxmlformats.org/officeDocument/2006/relationships" xmlns:m="http://schemas.openxmlformats.org/officeDocument/2006/math" xmlns:v="urn:schemas-microsoft-com:vml" xmlns:wp14="http://schemas.microsoft.com/office/word/2010/wordprocessingDrawing" xmlns:wp="http://schemas.openxmlformats.org/drawingml/2006/wordprocessingDrawing" xmlns:w10="urn:schemas-microsoft-com:office:word" xmlns:w="http://schemas.openxmlformats.org/wordprocessingml/2006/main" xmlns:w14="http://schemas.microsoft.com/office/word/2010/wordml" xmlns:w15="http://schemas.microsoft.com/office/word/2012/wordml" xmlns:wpg="http://schemas.microsoft.com/office/word/2010/wordprocessingGroup" xmlns:wpi="http://schemas.microsoft.com/office/word/2010/wordprocessingInk" xmlns:wne="http://schemas.microsoft.com/office/word/2006/wordml" xmlns:wps="http://schemas.microsoft.com/office/word/2010/wordprocessingShape" xmlns:wpsCustomData="http://www.wps.cn/officeDocument/2013/wpsCustomData" mc:Ignorable="w14 w15 wp14">
   <w:p>
     <w:pPr>
-      <w:pStyle w:val="7"/>
+      <w:pStyle w:val="8"/>
       <w:jc w:val="center"/>
       <w:rPr>
         <w:rFonts w:hint="default" w:ascii="Times New Roman" w:hAnsi="Times New Roman" w:cs="Times New Roman"/>
@@ -1989,7 +1858,7 @@
 <w:ftr xmlns:wpc="http://schemas.microsoft.com/office/word/2010/wordprocessingCanvas" xmlns:mc="http://schemas.openxmlformats.org/markup-compatibility/2006" xmlns:o="urn:schemas-microsoft-com:office:office" xmlns:r="http://schemas.openxmlformats.org/officeDocument/2006/relationships" xmlns:m="http://schemas.openxmlformats.org/officeDocument/2006/math" xmlns:v="urn:schemas-microsoft-com:vml" xmlns:wp14="http://schemas.microsoft.com/office/word/2010/wordprocessingDrawing" xmlns:wp="http://schemas.openxmlformats.org/drawingml/2006/wordprocessingDrawing" xmlns:w10="urn:schemas-microsoft-com:office:word" xmlns:w="http://schemas.openxmlformats.org/wordprocessingml/2006/main" xmlns:w14="http://schemas.microsoft.com/office/word/2010/wordml" xmlns:w15="http://schemas.microsoft.com/office/word/2012/wordml" xmlns:wpg="http://schemas.microsoft.com/office/word/2010/wordprocessingGroup" xmlns:wpi="http://schemas.microsoft.com/office/word/2010/wordprocessingInk" xmlns:wne="http://schemas.microsoft.com/office/word/2006/wordml" xmlns:wps="http://schemas.microsoft.com/office/word/2010/wordprocessingShape" xmlns:wpsCustomData="http://www.wps.cn/officeDocument/2013/wpsCustomData" mc:Ignorable="w14 w15 wp14">
   <w:p>
     <w:pPr>
-      <w:pStyle w:val="7"/>
+      <w:pStyle w:val="8"/>
       <w:jc w:val="center"/>
       <w:rPr>
         <w:rFonts w:hint="default" w:ascii="Times New Roman" w:hAnsi="Times New Roman" w:cs="Times New Roman"/>
@@ -2034,22 +1903,6 @@
                       <a:ln w="6350">
                         <a:noFill/>
                       </a:ln>
-                      <a:extLst>
-                        <a:ext uri="{909E8E84-426E-40DD-AFC4-6F175D3DCCD1}">
-                          <a14:hiddenFill xmlns:a14="http://schemas.microsoft.com/office/drawing/2010/main">
-                            <a:solidFill>
-                              <a:schemeClr val="lt1"/>
-                            </a:solidFill>
-                          </a14:hiddenFill>
-                        </a:ext>
-                        <a:ext uri="{91240B29-F687-4F45-9708-019B960494DF}">
-                          <a14:hiddenLine xmlns:a14="http://schemas.microsoft.com/office/drawing/2010/main" w="6350">
-                            <a:solidFill>
-                              <a:prstClr val="black"/>
-                            </a:solidFill>
-                          </a14:hiddenLine>
-                        </a:ext>
-                      </a:extLst>
                     </wps:spPr>
                     <wps:style>
                       <a:lnRef idx="0">
@@ -2069,7 +1922,7 @@
                       <w:txbxContent>
                         <w:p>
                           <w:pPr>
-                            <w:pStyle w:val="7"/>
+                            <w:pStyle w:val="8"/>
                           </w:pPr>
                           <w:r>
                             <w:fldChar w:fldCharType="begin"/>
@@ -2100,7 +1953,7 @@
         </mc:Choice>
         <mc:Fallback>
           <w:pict>
-            <v:shape id="_x0000_s1026" o:spid="_x0000_s1026" o:spt="202" type="#_x0000_t202" style="position:absolute;left:0pt;margin-top:0pt;height:144pt;width:144pt;mso-position-horizontal:center;mso-position-horizontal-relative:margin;mso-wrap-style:none;z-index:251659264;mso-width-relative:page;mso-height-relative:page;" filled="f" stroked="f" coordsize="21600,21600" o:gfxdata="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">
+            <v:shape id="_x0000_s1026" o:spid="_x0000_s1026" o:spt="202" type="#_x0000_t202" style="position:absolute;left:0pt;margin-top:0pt;height:144pt;width:144pt;mso-position-horizontal:center;mso-position-horizontal-relative:margin;mso-wrap-style:none;z-index:251659264;mso-width-relative:page;mso-height-relative:page;" filled="f" stroked="f" coordsize="21600,21600" o:gfxdata="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">
               <v:fill on="f" focussize="0,0"/>
               <v:stroke on="f" weight="0.5pt"/>
               <v:imagedata o:title=""/>
@@ -2109,7 +1962,7 @@
                 <w:txbxContent>
                   <w:p>
                     <w:pPr>
-                      <w:pStyle w:val="7"/>
+                      <w:pStyle w:val="8"/>
                     </w:pPr>
                     <w:r>
                       <w:fldChar w:fldCharType="begin"/>
@@ -2142,7 +1995,7 @@
 <w:ftr xmlns:wpc="http://schemas.microsoft.com/office/word/2010/wordprocessingCanvas" xmlns:mc="http://schemas.openxmlformats.org/markup-compatibility/2006" xmlns:o="urn:schemas-microsoft-com:office:office" xmlns:r="http://schemas.openxmlformats.org/officeDocument/2006/relationships" xmlns:m="http://schemas.openxmlformats.org/officeDocument/2006/math" xmlns:v="urn:schemas-microsoft-com:vml" xmlns:wp14="http://schemas.microsoft.com/office/word/2010/wordprocessingDrawing" xmlns:wp="http://schemas.openxmlformats.org/drawingml/2006/wordprocessingDrawing" xmlns:w10="urn:schemas-microsoft-com:office:word" xmlns:w="http://schemas.openxmlformats.org/wordprocessingml/2006/main" xmlns:w14="http://schemas.microsoft.com/office/word/2010/wordml" xmlns:w15="http://schemas.microsoft.com/office/word/2012/wordml" xmlns:wpg="http://schemas.microsoft.com/office/word/2010/wordprocessingGroup" xmlns:wpi="http://schemas.microsoft.com/office/word/2010/wordprocessingInk" xmlns:wne="http://schemas.microsoft.com/office/word/2006/wordml" xmlns:wps="http://schemas.microsoft.com/office/word/2010/wordprocessingShape" xmlns:wpsCustomData="http://www.wps.cn/officeDocument/2013/wpsCustomData" mc:Ignorable="w14 w15 wp14">
   <w:p>
     <w:pPr>
-      <w:pStyle w:val="7"/>
+      <w:pStyle w:val="8"/>
       <w:jc w:val="center"/>
       <w:rPr>
         <w:rFonts w:hint="default" w:ascii="Times New Roman" w:hAnsi="Times New Roman" w:cs="Times New Roman"/>
@@ -2187,22 +2040,6 @@
                       <a:ln w="6350">
                         <a:noFill/>
                       </a:ln>
-                      <a:extLst>
-                        <a:ext uri="{909E8E84-426E-40DD-AFC4-6F175D3DCCD1}">
-                          <a14:hiddenFill xmlns:a14="http://schemas.microsoft.com/office/drawing/2010/main">
-                            <a:solidFill>
-                              <a:schemeClr val="lt1"/>
-                            </a:solidFill>
-                          </a14:hiddenFill>
-                        </a:ext>
-                        <a:ext uri="{91240B29-F687-4F45-9708-019B960494DF}">
-                          <a14:hiddenLine xmlns:a14="http://schemas.microsoft.com/office/drawing/2010/main" w="6350">
-                            <a:solidFill>
-                              <a:prstClr val="black"/>
-                            </a:solidFill>
-                          </a14:hiddenLine>
-                        </a:ext>
-                      </a:extLst>
                     </wps:spPr>
                     <wps:style>
                       <a:lnRef idx="0">
@@ -2222,7 +2059,7 @@
                       <w:txbxContent>
                         <w:p>
                           <w:pPr>
-                            <w:pStyle w:val="7"/>
+                            <w:pStyle w:val="8"/>
                             <w:rPr>
                               <w:rFonts w:hint="default" w:ascii="Times New Roman" w:hAnsi="Times New Roman" w:cs="Times New Roman"/>
                             </w:rPr>
@@ -2271,7 +2108,7 @@
         </mc:Choice>
         <mc:Fallback>
           <w:pict>
-            <v:shape id="_x0000_s1026" o:spid="_x0000_s1026" o:spt="202" type="#_x0000_t202" style="position:absolute;left:0pt;margin-top:0pt;height:19.65pt;width:144pt;mso-position-horizontal:center;mso-position-horizontal-relative:margin;mso-wrap-style:none;z-index:251660288;mso-width-relative:page;mso-height-relative:page;" filled="f" stroked="f" coordsize="21600,21600" o:gfxdata="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">
+            <v:shape id="_x0000_s1026" o:spid="_x0000_s1026" o:spt="202" type="#_x0000_t202" style="position:absolute;left:0pt;margin-top:0pt;height:19.65pt;width:144pt;mso-position-horizontal:center;mso-position-horizontal-relative:margin;mso-wrap-style:none;z-index:251660288;mso-width-relative:page;mso-height-relative:page;" filled="f" stroked="f" coordsize="21600,21600" o:gfxdata="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">
               <v:fill on="f" focussize="0,0"/>
               <v:stroke on="f" weight="0.5pt"/>
               <v:imagedata o:title=""/>
@@ -2280,7 +2117,7 @@
                 <w:txbxContent>
                   <w:p>
                     <w:pPr>
-                      <w:pStyle w:val="7"/>
+                      <w:pStyle w:val="8"/>
                       <w:rPr>
                         <w:rFonts w:hint="default" w:ascii="Times New Roman" w:hAnsi="Times New Roman" w:cs="Times New Roman"/>
                       </w:rPr>
@@ -2394,8 +2231,8 @@
     <w:lsdException w:unhideWhenUsed="0" w:uiPriority="0" w:semiHidden="0" w:name="Normal Indent"/>
     <w:lsdException w:unhideWhenUsed="0" w:uiPriority="0" w:semiHidden="0" w:name="footnote text"/>
     <w:lsdException w:unhideWhenUsed="0" w:uiPriority="0" w:semiHidden="0" w:name="annotation text"/>
-    <w:lsdException w:unhideWhenUsed="0" w:uiPriority="0" w:semiHidden="0" w:name="header"/>
-    <w:lsdException w:unhideWhenUsed="0" w:uiPriority="0" w:semiHidden="0" w:name="footer"/>
+    <w:lsdException w:qFormat="1" w:unhideWhenUsed="0" w:uiPriority="0" w:semiHidden="0" w:name="header"/>
+    <w:lsdException w:qFormat="1" w:unhideWhenUsed="0" w:uiPriority="0" w:semiHidden="0" w:name="footer"/>
     <w:lsdException w:unhideWhenUsed="0" w:uiPriority="0" w:semiHidden="0" w:name="index heading"/>
     <w:lsdException w:qFormat="1" w:uiPriority="0" w:name="caption"/>
     <w:lsdException w:unhideWhenUsed="0" w:uiPriority="0" w:semiHidden="0" w:name="table of figures"/>
@@ -2448,8 +2285,8 @@
     <w:lsdException w:unhideWhenUsed="0" w:uiPriority="0" w:semiHidden="0" w:name="Body Text Indent 2"/>
     <w:lsdException w:unhideWhenUsed="0" w:uiPriority="0" w:semiHidden="0" w:name="Body Text Indent 3"/>
     <w:lsdException w:unhideWhenUsed="0" w:uiPriority="0" w:semiHidden="0" w:name="Block Text"/>
-    <w:lsdException w:unhideWhenUsed="0" w:uiPriority="0" w:semiHidden="0" w:name="Hyperlink"/>
-    <w:lsdException w:unhideWhenUsed="0" w:uiPriority="0" w:semiHidden="0" w:name="FollowedHyperlink"/>
+    <w:lsdException w:qFormat="1" w:unhideWhenUsed="0" w:uiPriority="0" w:semiHidden="0" w:name="Hyperlink"/>
+    <w:lsdException w:qFormat="1" w:unhideWhenUsed="0" w:uiPriority="0" w:semiHidden="0" w:name="FollowedHyperlink"/>
     <w:lsdException w:qFormat="1" w:unhideWhenUsed="0" w:uiPriority="0" w:semiHidden="0" w:name="Strong"/>
     <w:lsdException w:qFormat="1" w:unhideWhenUsed="0" w:uiPriority="0" w:semiHidden="0" w:name="Emphasis"/>
     <w:lsdException w:unhideWhenUsed="0" w:uiPriority="0" w:semiHidden="0" w:name="Document Map"/>
@@ -2573,17 +2410,29 @@
     </w:tblPr>
   </w:style>
   <w:style w:type="character" w:styleId="5">
+    <w:name w:val="FollowedHyperlink"/>
+    <w:basedOn w:val="3"/>
+    <w:qFormat/>
+    <w:uiPriority w:val="0"/>
+    <w:rPr>
+      <w:color w:val="800080"/>
+      <w:u w:val="single"/>
+    </w:rPr>
+  </w:style>
+  <w:style w:type="character" w:styleId="6">
     <w:name w:val="Hyperlink"/>
     <w:basedOn w:val="3"/>
+    <w:qFormat/>
     <w:uiPriority w:val="0"/>
     <w:rPr>
       <w:color w:val="0000FF"/>
       <w:u w:val="single"/>
     </w:rPr>
   </w:style>
-  <w:style w:type="paragraph" w:styleId="6">
+  <w:style w:type="paragraph" w:styleId="7">
     <w:name w:val="header"/>
     <w:basedOn w:val="1"/>
+    <w:qFormat/>
     <w:uiPriority w:val="0"/>
     <w:pPr>
       <w:tabs>
@@ -2592,9 +2441,10 @@
       </w:tabs>
     </w:pPr>
   </w:style>
-  <w:style w:type="paragraph" w:styleId="7">
+  <w:style w:type="paragraph" w:styleId="8">
     <w:name w:val="footer"/>
     <w:basedOn w:val="1"/>
+    <w:qFormat/>
     <w:uiPriority w:val="0"/>
     <w:pPr>
       <w:tabs>

</xml_diff>